<commit_message>
Update executive summary DOCX and add PDF
Modify docs/ResumenEjecutivo_v4_FINAL_Equipo48.docx and add a generated PDF version (docs/ResumenEjecutivo_v4_FINAL_Equipo48.pdf) for easier distribution and review. The DOCX was updated and a corresponding PDF export was included in the repository.
</commit_message>
<xml_diff>
--- a/docs/ResumenEjecutivo_v4_FINAL_Equipo48.docx
+++ b/docs/ResumenEjecutivo_v4_FINAL_Equipo48.docx
@@ -960,6 +960,8 @@
       </w:tr>
     </w:tbl>
     <w:p/>
+    <w:p/>
+    <w:p/>
     <w:p>
       <w:pPr>
         <w:pBdr>
@@ -974,6 +976,7 @@
           <w:color w:val="003987"/>
           <w:sz w:val="30"/>
         </w:rPr>
+        <w:lastRenderedPageBreak/>
         <w:t>3. Modelos Evaluados y Elección del Modelo Final</w:t>
       </w:r>
     </w:p>
@@ -1022,7 +1025,6 @@
                 <w:color w:val="FFFFFF"/>
                 <w:sz w:val="20"/>
               </w:rPr>
-              <w:lastRenderedPageBreak/>
               <w:t>Avance</w:t>
             </w:r>
           </w:p>
@@ -2114,12 +2116,22 @@
           <w:b/>
           <w:color w:val="003987"/>
         </w:rPr>
-        <w:t>• RMSE = 0.6117: Error promedio de ~0.6 g CH4/kg leche. Dentro del umbral de acción para ajuste de nutracéuticos.</w:t>
+        <w:t xml:space="preserve">• RMSE = </w:t>
       </w:r>
       <w:r>
         <w:rPr>
           <w:rFonts w:ascii="Calibri" w:hAnsi="Calibri"/>
+          <w:b/>
+          <w:color w:val="003987"/>
         </w:rPr>
+        <w:t xml:space="preserve">0.6117: </w:t>
+      </w:r>
+      <w:r>
+        <w:rPr>
+          <w:rFonts w:ascii="Calibri" w:hAnsi="Calibri"/>
+          <w:bCs/>
+        </w:rPr>
+        <w:t>Error promedio de ~0.6 g CH4/kg leche. Dentro del umbral de acción para ajuste de nutracéuticos.</w:t>
       </w:r>
     </w:p>
     <w:p>
@@ -2628,7 +2640,16 @@
                 <w:color w:val="1A1A1A"/>
                 <w:sz w:val="20"/>
               </w:rPr>
-              <w:t>Modelo actualizado ante cambios estacionales</w:t>
+              <w:t xml:space="preserve">Modelo actualizado ante </w:t>
+            </w:r>
+            <w:r>
+              <w:rPr>
+                <w:rFonts w:ascii="Calibri" w:hAnsi="Calibri"/>
+                <w:color w:val="1A1A1A"/>
+                <w:sz w:val="20"/>
+              </w:rPr>
+              <w:lastRenderedPageBreak/>
+              <w:t>cambios estacionales</w:t>
             </w:r>
           </w:p>
         </w:tc>
@@ -2796,14 +2817,56 @@
       <w:pPr>
         <w:spacing w:after="120"/>
         <w:jc w:val="both"/>
+        <w:rPr>
+          <w:rFonts w:ascii="Calibri" w:hAnsi="Calibri"/>
+          <w:color w:val="1A1A1A"/>
+        </w:rPr>
       </w:pPr>
       <w:r>
         <w:rPr>
           <w:rFonts w:ascii="Calibri" w:hAnsi="Calibri"/>
           <w:color w:val="1A1A1A"/>
         </w:rPr>
-        <w:t>Plataforma cloud recomendada: GCP — score 8.85/10 en matriz ponderada (vs AWS 8.55, Azure 8.50, IBM Watson 6.55). Cloud Run serverless a ~$31 USD/mes, integración nativa sklearn en Vertex AI y $300 USD de crédito inicial.</w:t>
+        <w:t xml:space="preserve">Plataforma cloud recomendada: GCP — score 8.85/10 en matriz ponderada (vs AWS 8.55, Azure 8.50, IBM Watson 6.55). Cloud Run serverless a ~$31 USD/mes, integración nativa sklearn en Vertex AI y $300 USD de </w:t>
       </w:r>
+      <w:proofErr w:type="spellStart"/>
+      <w:r>
+        <w:rPr>
+          <w:rFonts w:ascii="Calibri" w:hAnsi="Calibri"/>
+          <w:color w:val="1A1A1A"/>
+        </w:rPr>
+        <w:t>crédito</w:t>
+      </w:r>
+      <w:proofErr w:type="spellEnd"/>
+      <w:r>
+        <w:rPr>
+          <w:rFonts w:ascii="Calibri" w:hAnsi="Calibri"/>
+          <w:color w:val="1A1A1A"/>
+        </w:rPr>
+        <w:t xml:space="preserve"> </w:t>
+      </w:r>
+      <w:proofErr w:type="spellStart"/>
+      <w:r>
+        <w:rPr>
+          <w:rFonts w:ascii="Calibri" w:hAnsi="Calibri"/>
+          <w:color w:val="1A1A1A"/>
+        </w:rPr>
+        <w:t>inicial</w:t>
+      </w:r>
+      <w:proofErr w:type="spellEnd"/>
+      <w:r>
+        <w:rPr>
+          <w:rFonts w:ascii="Calibri" w:hAnsi="Calibri"/>
+          <w:color w:val="1A1A1A"/>
+        </w:rPr>
+        <w:t>.</w:t>
+      </w:r>
+    </w:p>
+    <w:p>
+      <w:pPr>
+        <w:spacing w:after="120"/>
+        <w:jc w:val="both"/>
+      </w:pPr>
     </w:p>
     <w:p>
       <w:pPr>
@@ -3389,6 +3452,7 @@
                 <w:color w:val="1A1A1A"/>
                 <w:sz w:val="20"/>
               </w:rPr>
+              <w:lastRenderedPageBreak/>
               <w:t>Despliegue</w:t>
             </w:r>
           </w:p>
@@ -3468,7 +3532,6 @@
                 <w:color w:val="1A1A1A"/>
                 <w:sz w:val="20"/>
               </w:rPr>
-              <w:lastRenderedPageBreak/>
               <w:t>Infraestructura GCP</w:t>
             </w:r>
           </w:p>
@@ -4263,6 +4326,7 @@
           <w:b/>
           <w:color w:val="003987"/>
         </w:rPr>
+        <w:lastRenderedPageBreak/>
         <w:t xml:space="preserve">• Escalabilidad y replicabilidad: </w:t>
       </w:r>
       <w:r>
@@ -5068,7 +5132,16 @@
                 <w:color w:val="1A1A1A"/>
                 <w:sz w:val="20"/>
               </w:rPr>
-              <w:t>LFPDPPP: si se almacenan nombres de veterinarios o propietarios (personas físicas), aplica la ley federal de protección de datos</w:t>
+              <w:t xml:space="preserve">LFPDPPP: si se almacenan nombres de veterinarios o propietarios (personas físicas), </w:t>
+            </w:r>
+            <w:r>
+              <w:rPr>
+                <w:rFonts w:ascii="Calibri" w:hAnsi="Calibri"/>
+                <w:color w:val="1A1A1A"/>
+                <w:sz w:val="20"/>
+              </w:rPr>
+              <w:lastRenderedPageBreak/>
+              <w:t>aplica la ley federal de protección de datos</w:t>
             </w:r>
           </w:p>
         </w:tc>
@@ -5088,6 +5161,7 @@
                 <w:color w:val="1A1A1A"/>
                 <w:sz w:val="20"/>
               </w:rPr>
+              <w:lastRenderedPageBreak/>
               <w:t>Media</w:t>
             </w:r>
           </w:p>
@@ -5127,7 +5201,16 @@
                 <w:color w:val="1A1A1A"/>
                 <w:sz w:val="20"/>
               </w:rPr>
-              <w:t>Minimización de datos PII: trabajar con IDs anónimos. Aviso de privacidad + Cloud DPA firmado con GCP.</w:t>
+              <w:t xml:space="preserve">Minimización de datos PII: trabajar con IDs anónimos. Aviso de privacidad + </w:t>
+            </w:r>
+            <w:r>
+              <w:rPr>
+                <w:rFonts w:ascii="Calibri" w:hAnsi="Calibri"/>
+                <w:color w:val="1A1A1A"/>
+                <w:sz w:val="20"/>
+              </w:rPr>
+              <w:lastRenderedPageBreak/>
+              <w:t>Cloud DPA firmado con GCP.</w:t>
             </w:r>
           </w:p>
         </w:tc>
@@ -5148,6 +5231,7 @@
                 <w:color w:val="1A1A1A"/>
                 <w:sz w:val="20"/>
               </w:rPr>
+              <w:lastRenderedPageBreak/>
               <w:t>CUMPLIMIENTO REGULATORIO</w:t>
             </w:r>
           </w:p>
@@ -5167,16 +5251,7 @@
                 <w:color w:val="1A1A1A"/>
                 <w:sz w:val="20"/>
               </w:rPr>
-              <w:t xml:space="preserve">Auditabilidad para certificaciones de carbono: el modelo debe ser </w:t>
-            </w:r>
-            <w:r>
-              <w:rPr>
-                <w:rFonts w:ascii="Calibri" w:hAnsi="Calibri"/>
-                <w:color w:val="1A1A1A"/>
-                <w:sz w:val="20"/>
-              </w:rPr>
-              <w:lastRenderedPageBreak/>
-              <w:t>trazable y reproducible por auditores externos</w:t>
+              <w:t>Auditabilidad para certificaciones de carbono: el modelo debe ser trazable y reproducible por auditores externos</w:t>
             </w:r>
           </w:p>
         </w:tc>
@@ -5196,7 +5271,6 @@
                 <w:color w:val="1A1A1A"/>
                 <w:sz w:val="20"/>
               </w:rPr>
-              <w:lastRenderedPageBreak/>
               <w:t>Media</w:t>
             </w:r>
           </w:p>
@@ -5236,16 +5310,7 @@
                 <w:color w:val="1A1A1A"/>
                 <w:sz w:val="20"/>
               </w:rPr>
-              <w:t xml:space="preserve">Versionado completo en MLflow. Registro </w:t>
-            </w:r>
-            <w:r>
-              <w:rPr>
-                <w:rFonts w:ascii="Calibri" w:hAnsi="Calibri"/>
-                <w:color w:val="1A1A1A"/>
-                <w:sz w:val="20"/>
-              </w:rPr>
-              <w:lastRenderedPageBreak/>
-              <w:t>inmutable de predicciones con hash del modelo. Documentación CRISP-ML(Q).</w:t>
+              <w:t>Versionado completo en MLflow. Registro inmutable de predicciones con hash del modelo. Documentación CRISP-ML(Q).</w:t>
             </w:r>
           </w:p>
         </w:tc>

</xml_diff>